<commit_message>
Publish sync from Student_labs (Labs a5cbdbb)
</commit_message>
<xml_diff>
--- a/questionnaire/Lab 5 - Questionnaire.docx
+++ b/questionnaire/Lab 5 - Questionnaire.docx
@@ -1647,6 +1647,181 @@
       </w:pPr>
     </w:p>
     <w:p>
+      <w:r>
+        <w:lastRenderedPageBreak/>
+        <w:t>[Q4c1] Explain the linear system you assembled inside single_resectioning. Why are there two rows per 2D–3D correspondence (instead of one or three)? What does the right-singular vector associated with the smallest singular value of A represent, and why do you multiply by T₁⁻¹ and T₂ at the end?</w:t>
+      </w:r>
+    </w:p>
+    <w:tbl>
+      <w:tblPr>
+        <w:tblW w:w="9026" w:type="dxa"/>
+        <w:tblBorders>
+          <w:top w:val="single" w:sz="4" w:space="0" w:color="auto"/>
+          <w:left w:val="single" w:sz="4" w:space="0" w:color="auto"/>
+          <w:bottom w:val="single" w:sz="4" w:space="0" w:color="auto"/>
+          <w:right w:val="single" w:sz="4" w:space="0" w:color="auto"/>
+          <w:insideH w:val="single" w:sz="4" w:space="0" w:color="auto"/>
+          <w:insideV w:val="single" w:sz="4" w:space="0" w:color="auto"/>
+        </w:tblBorders>
+        <w:tblCellMar>
+          <w:left w:w="10" w:type="dxa"/>
+          <w:right w:w="10" w:type="dxa"/>
+        </w:tblCellMar>
+        <w:tblLook w:val="04A0" w:firstRow="1" w:lastRow="0" w:firstColumn="1" w:lastColumn="0" w:noHBand="0" w:noVBand="1"/>
+      </w:tblPr>
+      <w:tblGrid>
+        <w:gridCol w:w="9026"/>
+      </w:tblGrid>
+      <w:tr>
+        <w:trPr>
+          <w:trHeight w:val="3302"/>
+        </w:trPr>
+        <w:tc>
+          <w:tcPr>
+            <w:tcW w:w="9026" w:type="dxa"/>
+            <w:tcBorders>
+              <w:top w:val="single" w:sz="8" w:space="0" w:color="4472C4"/>
+              <w:left w:val="single" w:sz="8" w:space="0" w:color="4472C4"/>
+              <w:bottom w:val="single" w:sz="8" w:space="0" w:color="4472C4"/>
+              <w:right w:val="single" w:sz="8" w:space="0" w:color="4472C4"/>
+            </w:tcBorders>
+            <w:shd w:val="clear" w:color="auto" w:fill="E6F2FF"/>
+            <w:tcMar>
+              <w:top w:w="120" w:type="dxa"/>
+              <w:left w:w="180" w:type="dxa"/>
+              <w:bottom w:w="120" w:type="dxa"/>
+              <w:right w:w="180" w:type="dxa"/>
+            </w:tcMar>
+          </w:tcPr>
+          <w:p/>
+        </w:tc>
+      </w:tr>
+    </w:tbl>
+    <w:p>
+      <w:pPr>
+        <w:rPr>
+          <w:b/>
+          <w:bCs/>
+        </w:rPr>
+      </w:pPr>
+    </w:p>
+    <w:p>
+      <w:r>
+        <w:t>[Q4c2] In find_resectioning_inliers, which residual do you compare against the threshold th — pixel error in the image or 3D error in space? Why? How would you pick a sensible value of th for this dataset?</w:t>
+      </w:r>
+    </w:p>
+    <w:tbl>
+      <w:tblPr>
+        <w:tblW w:w="9026" w:type="dxa"/>
+        <w:tblBorders>
+          <w:top w:val="single" w:sz="4" w:space="0" w:color="auto"/>
+          <w:left w:val="single" w:sz="4" w:space="0" w:color="auto"/>
+          <w:bottom w:val="single" w:sz="4" w:space="0" w:color="auto"/>
+          <w:right w:val="single" w:sz="4" w:space="0" w:color="auto"/>
+          <w:insideH w:val="single" w:sz="4" w:space="0" w:color="auto"/>
+          <w:insideV w:val="single" w:sz="4" w:space="0" w:color="auto"/>
+        </w:tblBorders>
+        <w:tblCellMar>
+          <w:left w:w="10" w:type="dxa"/>
+          <w:right w:w="10" w:type="dxa"/>
+        </w:tblCellMar>
+        <w:tblLook w:val="04A0" w:firstRow="1" w:lastRow="0" w:firstColumn="1" w:lastColumn="0" w:noHBand="0" w:noVBand="1"/>
+      </w:tblPr>
+      <w:tblGrid>
+        <w:gridCol w:w="9026"/>
+      </w:tblGrid>
+      <w:tr>
+        <w:trPr>
+          <w:trHeight w:val="2759"/>
+        </w:trPr>
+        <w:tc>
+          <w:tcPr>
+            <w:tcW w:w="9026" w:type="dxa"/>
+            <w:tcBorders>
+              <w:top w:val="single" w:sz="8" w:space="0" w:color="4472C4"/>
+              <w:left w:val="single" w:sz="8" w:space="0" w:color="4472C4"/>
+              <w:bottom w:val="single" w:sz="8" w:space="0" w:color="4472C4"/>
+              <w:right w:val="single" w:sz="8" w:space="0" w:color="4472C4"/>
+            </w:tcBorders>
+            <w:shd w:val="clear" w:color="auto" w:fill="E6F2FF"/>
+            <w:tcMar>
+              <w:top w:w="120" w:type="dxa"/>
+              <w:left w:w="180" w:type="dxa"/>
+              <w:bottom w:w="120" w:type="dxa"/>
+              <w:right w:w="180" w:type="dxa"/>
+            </w:tcMar>
+          </w:tcPr>
+          <w:p/>
+        </w:tc>
+      </w:tr>
+    </w:tbl>
+    <w:p>
+      <w:pPr>
+        <w:rPr>
+          <w:b/>
+          <w:bCs/>
+        </w:rPr>
+      </w:pPr>
+    </w:p>
+    <w:p>
+      <w:r>
+        <w:t>[Q4c3] Inside ransac_resectioning_adaptive_loop, what is the minimum sample size s and why exactly that number? How does the adaptive update of N (the iteration budget) work each time a larger inlier set is found? Why do you re-fit single_resectioning on the full inlier set at the end?</w:t>
+      </w:r>
+    </w:p>
+    <w:tbl>
+      <w:tblPr>
+        <w:tblW w:w="9026" w:type="dxa"/>
+        <w:tblBorders>
+          <w:top w:val="single" w:sz="4" w:space="0" w:color="auto"/>
+          <w:left w:val="single" w:sz="4" w:space="0" w:color="auto"/>
+          <w:bottom w:val="single" w:sz="4" w:space="0" w:color="auto"/>
+          <w:right w:val="single" w:sz="4" w:space="0" w:color="auto"/>
+          <w:insideH w:val="single" w:sz="4" w:space="0" w:color="auto"/>
+          <w:insideV w:val="single" w:sz="4" w:space="0" w:color="auto"/>
+        </w:tblBorders>
+        <w:tblCellMar>
+          <w:left w:w="10" w:type="dxa"/>
+          <w:right w:w="10" w:type="dxa"/>
+        </w:tblCellMar>
+        <w:tblLook w:val="04A0" w:firstRow="1" w:lastRow="0" w:firstColumn="1" w:lastColumn="0" w:noHBand="0" w:noVBand="1"/>
+      </w:tblPr>
+      <w:tblGrid>
+        <w:gridCol w:w="9026"/>
+      </w:tblGrid>
+      <w:tr>
+        <w:trPr>
+          <w:trHeight w:val="2619"/>
+        </w:trPr>
+        <w:tc>
+          <w:tcPr>
+            <w:tcW w:w="9026" w:type="dxa"/>
+            <w:tcBorders>
+              <w:top w:val="single" w:sz="8" w:space="0" w:color="4472C4"/>
+              <w:left w:val="single" w:sz="8" w:space="0" w:color="4472C4"/>
+              <w:bottom w:val="single" w:sz="8" w:space="0" w:color="4472C4"/>
+              <w:right w:val="single" w:sz="8" w:space="0" w:color="4472C4"/>
+            </w:tcBorders>
+            <w:shd w:val="clear" w:color="auto" w:fill="E6F2FF"/>
+            <w:tcMar>
+              <w:top w:w="120" w:type="dxa"/>
+              <w:left w:w="180" w:type="dxa"/>
+              <w:bottom w:w="120" w:type="dxa"/>
+              <w:right w:w="180" w:type="dxa"/>
+            </w:tcMar>
+          </w:tcPr>
+          <w:p/>
+        </w:tc>
+      </w:tr>
+    </w:tbl>
+    <w:p>
+      <w:pPr>
+        <w:rPr>
+          <w:b/>
+          <w:bCs/>
+        </w:rPr>
+      </w:pPr>
+    </w:p>
+    <w:p>
       <w:pPr>
         <w:rPr>
           <w:b/>
@@ -2647,7 +2822,19 @@
     <w:p>
       <w:r>
         <w:lastRenderedPageBreak/>
-        <w:t>[Q5f] Pipeline improvement. Based on the inlier ratios, cloud sizes, and reprojection errors you reported above, how would you improve the pipeline to obtain denser point clouds AND lower reprojection errors? Discuss at least three concrete ideas (e.g., feature detector / matcher choice, RANSAC thresholds and iterations, non-linear refinement / bundle adjustment, lens distortion correction, sub-pixel feature refinement, additional views, guided matching from the epipolar geometry, …). For each idea, name the metric you expect it to improve (density or error) and explain why.</w:t>
+        <w:t xml:space="preserve">[Q5f] Pipeline improvement. Based on the inlier ratios, cloud sizes, and reprojection errors you reported above, how would you improve the pipeline to obtain denser point clouds AND lower reprojection errors? Discuss at least </w:t>
+      </w:r>
+      <w:r>
+        <w:t>two</w:t>
+      </w:r>
+      <w:r>
+        <w:t xml:space="preserve"> concrete ideas</w:t>
+      </w:r>
+      <w:r>
+        <w:t xml:space="preserve">. </w:t>
+      </w:r>
+      <w:r>
+        <w:t>For each idea, name the metric you expect it to improve (density or error) and explain why.</w:t>
       </w:r>
     </w:p>
     <w:tbl>

</xml_diff>